<commit_message>
Add EEG preprocess lab steps and learning docs; ignore local datasets.
Keep BCI mat files and other raw EEG binaries out of the repo while syncing preprocess_lab code and step guides.

Co-authored-by: Cursor <cursoragent@cursor.com>
</commit_message>
<xml_diff>
--- a/资料/项目计划/面向少样本个体适配的运动想象脑机接口系统设计.docx
+++ b/资料/项目计划/面向少样本个体适配的运动想象脑机接口系统设计.docx
@@ -309,11 +309,7 @@
         <w:jc w:val="left"/>
       </w:pPr>
       <w:r>
-        <w:rPr>
-          <w:rFonts w:eastAsia="等线" w:ascii="Arial" w:cs="Arial" w:hAnsi="Arial"/>
-          <w:sz w:val="22"/>
-        </w:rPr>
-        <w:t>本阶段严格控制实验变量统一，保证横向对比的公平性，统一设置实验参数：固定Linear基础分类头、交叉熵损失函数、Adam优化器、统一训练轮次与预处理流水线。整体流程如下：</w:t>
+        <w:t>本阶段严格控制实验变量统一，保证横向对比的公平性，统一设置实验参数：固定共享主干后的线性双分类头、交叉熵损失函数、Adam优化器、统一训练轮次与预处理流水线。整体流程如下：</w:t>
       </w:r>
     </w:p>
     <w:p>
@@ -547,6 +543,41 @@
           <w:sz w:val="22"/>
         </w:rPr>
         <w:t>所有模型完成统一离线预训练后，通过跨被试测试精度、泛化稳定性、微调适配潜力多维度评估，最终确定最优主干模型（EEG-Conformer），后续所有少样本微调实验均固定该模型架构，消除模型变量干扰。</w:t>
+      </w:r>
+    </w:p>
+    <w:p>
+      <w:r>
+        <w:t>3.1.2 共享主干双分类头与双标签设计</w:t>
+      </w:r>
+    </w:p>
+    <w:p>
+      <w:r>
+        <w:t>为同时完成任务态检测与最终三状态识别，模型采用一个共享特征提取主干和两个并行分类头。共享主干只执行一次特征提取；分类头1输出静息态/任务态二分类结果，分类头2输出空闲/左手/右手三分类结果。</w:t>
+      </w:r>
+    </w:p>
+    <w:p>
+      <w:r>
+        <w:t>统一数据中的每个EEG样本不需要复制两份，而是在同一条样本记录中同时保存两套监督标签：label_task表示任务状态，label_three表示最终三分类状态。</w:t>
+      </w:r>
+    </w:p>
+    <w:p>
+      <w:r>
+        <w:t>双标签映射规则：静息样本的label_task=0、label_three=0；左手样本的label_task=1、label_three=1；右手样本的label_task=1、label_three=2。</w:t>
+      </w:r>
+    </w:p>
+    <w:p>
+      <w:r>
+        <w:t>训练阶段两个分类头同时参与更新。任务头损失为静息/任务交叉熵，三分类头损失为空闲/左手/右手交叉熵，总损失定义为L=lambda_task*L_task+lambda_three*L_three，初始可设置lambda_task=1、lambda_three=1，并通过验证集调整。两个损失共同更新共享主干，各分类头仅由自身损失直接更新。</w:t>
+      </w:r>
+    </w:p>
+    <w:p>
+      <w:r>
+        <w:t>在线推理规则：若分类头1的任务概率未达到阈值，直接输出空闲；若达到任务阈值，再参考分类头2的左手、右手概率。不得在分类头2仍高概率判断为空闲时强制输出方向；两个头冲突或左右概率差距不足时，应输出空闲/不确定状态，避免误触发。</w:t>
+      </w:r>
+    </w:p>
+    <w:p>
+      <w:r>
+        <w:t>模型结构：EEG输入 -&gt; 共享EEGNet/EEG-Conformer主干 -&gt; 分类头1（静息/任务）与分类头2（空闲/左手/右手）并行输出。</w:t>
       </w:r>
     </w:p>
     <w:p>

</xml_diff>